<commit_message>
chore: #2 add answer to linux and AWS questions
</commit_message>
<xml_diff>
--- a/document/HW.docx
+++ b/document/HW.docx
@@ -45,16 +45,15 @@
             <w:rStyle w:val="Hyperlink"/>
             <w:lang w:val="en-US"/>
           </w:rPr>
-          <w:t>git@github.com:alivx/urless.git</w:t>
+          <w:t>git@github.com:momen-qasem/urless.git</w:t>
         </w:r>
       </w:hyperlink>
-    </w:p>
-    <w:p>
-      <w:pPr>
+      <w:r>
         <w:rPr>
           <w:lang w:val="en-US"/>
         </w:rPr>
-      </w:pPr>
+        <w:br/>
+      </w:r>
     </w:p>
     <w:p>
       <w:pPr>
@@ -263,6 +262,14 @@
     </w:p>
     <w:p>
       <w:r>
+        <w:t>2.6: create internet gateway</w:t>
+      </w:r>
+      <w:r>
+        <w:t xml:space="preserve"> and attach to application VPC also, verified the route table.</w:t>
+      </w:r>
+    </w:p>
+    <w:p>
+      <w:r>
         <w:t>2.</w:t>
       </w:r>
       <w:r>
@@ -270,6 +277,516 @@
       </w:r>
       <w:r>
         <w:t xml:space="preserve"> run playbook ansible.</w:t>
+      </w:r>
+    </w:p>
+    <w:p/>
+    <w:p/>
+    <w:p/>
+    <w:p/>
+    <w:p/>
+    <w:p/>
+    <w:p/>
+    <w:p/>
+    <w:p/>
+    <w:p/>
+    <w:p/>
+    <w:p/>
+    <w:p/>
+    <w:p/>
+    <w:p>
+      <w:pPr>
+        <w:rPr>
+          <w:b/>
+          <w:bCs/>
+          <w:sz w:val="32"/>
+          <w:szCs w:val="32"/>
+        </w:rPr>
+      </w:pPr>
+      <w:r>
+        <w:rPr>
+          <w:b/>
+          <w:bCs/>
+          <w:sz w:val="32"/>
+          <w:szCs w:val="32"/>
+        </w:rPr>
+        <w:t>Linux Questions:</w:t>
+      </w:r>
+    </w:p>
+    <w:p>
+      <w:r>
+        <w:t>1.</w:t>
+      </w:r>
+      <w:r>
+        <w:rPr>
+          <w:b/>
+          <w:bCs/>
+        </w:rPr>
+        <w:t> /dev/null</w:t>
+      </w:r>
+      <w:r>
+        <w:t>: A special file that discards all data written to it.</w:t>
+      </w:r>
+      <w:r>
+        <w:br/>
+      </w:r>
+      <w:r>
+        <w:t xml:space="preserve">used to </w:t>
+      </w:r>
+      <w:r>
+        <w:t>Redirect unwanted output, e.g., command &gt; /dev/null 2&gt;&amp;1.</w:t>
+      </w:r>
+    </w:p>
+    <w:p>
+      <w:r>
+        <w:t xml:space="preserve">2. </w:t>
+      </w:r>
+      <w:r>
+        <w:rPr>
+          <w:b/>
+          <w:bCs/>
+        </w:rPr>
+        <w:t>nice/renice</w:t>
+      </w:r>
+      <w:r>
+        <w:t>:</w:t>
+      </w:r>
+    </w:p>
+    <w:p>
+      <w:pPr>
+        <w:numPr>
+          <w:ilvl w:val="0"/>
+          <w:numId w:val="3"/>
+        </w:numPr>
+      </w:pPr>
+      <w:r>
+        <w:rPr>
+          <w:b/>
+          <w:bCs/>
+        </w:rPr>
+        <w:t>nice</w:t>
+      </w:r>
+      <w:r>
+        <w:t>: Start a process with a specific priority (nice -n 10 command).</w:t>
+      </w:r>
+    </w:p>
+    <w:p>
+      <w:pPr>
+        <w:numPr>
+          <w:ilvl w:val="0"/>
+          <w:numId w:val="3"/>
+        </w:numPr>
+      </w:pPr>
+      <w:r>
+        <w:rPr>
+          <w:b/>
+          <w:bCs/>
+        </w:rPr>
+        <w:t>renice</w:t>
+      </w:r>
+      <w:r>
+        <w:t>: Change the priority of a running process (renice 10 -p PID).</w:t>
+      </w:r>
+      <w:r>
+        <w:br/>
+        <w:t>U</w:t>
+      </w:r>
+      <w:r>
+        <w:t xml:space="preserve">sed for </w:t>
+      </w:r>
+      <w:r>
+        <w:t>Adjust process priority to optimize resource usage.</w:t>
+      </w:r>
+    </w:p>
+    <w:p>
+      <w:r>
+        <w:t>3.</w:t>
+      </w:r>
+      <w:r>
+        <w:rPr>
+          <w:b/>
+          <w:bCs/>
+        </w:rPr>
+        <w:t>Troubleshooting Slow Server</w:t>
+      </w:r>
+      <w:r>
+        <w:t>:</w:t>
+      </w:r>
+    </w:p>
+    <w:p>
+      <w:pPr>
+        <w:numPr>
+          <w:ilvl w:val="0"/>
+          <w:numId w:val="4"/>
+        </w:numPr>
+      </w:pPr>
+      <w:r>
+        <w:t>Check CPU/memory: top/htop.</w:t>
+      </w:r>
+    </w:p>
+    <w:p>
+      <w:pPr>
+        <w:numPr>
+          <w:ilvl w:val="0"/>
+          <w:numId w:val="4"/>
+        </w:numPr>
+      </w:pPr>
+      <w:r>
+        <w:t>Analyze disk I/O: iostat/iotop.</w:t>
+      </w:r>
+    </w:p>
+    <w:p>
+      <w:pPr>
+        <w:numPr>
+          <w:ilvl w:val="0"/>
+          <w:numId w:val="4"/>
+        </w:numPr>
+      </w:pPr>
+      <w:r>
+        <w:t>Network issues: netstat/ss.</w:t>
+      </w:r>
+    </w:p>
+    <w:p>
+      <w:pPr>
+        <w:numPr>
+          <w:ilvl w:val="0"/>
+          <w:numId w:val="4"/>
+        </w:numPr>
+      </w:pPr>
+      <w:r>
+        <w:t>Logs: Review system logs in /var/log.</w:t>
+      </w:r>
+    </w:p>
+    <w:p>
+      <w:r>
+        <w:t xml:space="preserve">4. </w:t>
+      </w:r>
+      <w:r>
+        <w:t xml:space="preserve"> </w:t>
+      </w:r>
+      <w:r>
+        <w:rPr>
+          <w:b/>
+          <w:bCs/>
+        </w:rPr>
+        <w:t>Determine CPU Cores</w:t>
+      </w:r>
+      <w:r>
+        <w:t>:</w:t>
+      </w:r>
+    </w:p>
+    <w:p>
+      <w:pPr>
+        <w:numPr>
+          <w:ilvl w:val="0"/>
+          <w:numId w:val="5"/>
+        </w:numPr>
+      </w:pPr>
+      <w:r>
+        <w:t>nproc or lscpu.</w:t>
+      </w:r>
+    </w:p>
+    <w:p>
+      <w:pPr>
+        <w:numPr>
+          <w:ilvl w:val="0"/>
+          <w:numId w:val="5"/>
+        </w:numPr>
+      </w:pPr>
+      <w:r>
+        <w:t>View /proc/cpuinfo: grep -c ^processor /proc/cpuinfo.</w:t>
+      </w:r>
+    </w:p>
+    <w:p/>
+    <w:p/>
+    <w:p/>
+    <w:p/>
+    <w:p/>
+    <w:p/>
+    <w:p/>
+    <w:p/>
+    <w:p/>
+    <w:p/>
+    <w:p/>
+    <w:p>
+      <w:pPr>
+        <w:rPr>
+          <w:b/>
+          <w:bCs/>
+          <w:sz w:val="32"/>
+          <w:szCs w:val="32"/>
+        </w:rPr>
+      </w:pPr>
+      <w:r>
+        <w:rPr>
+          <w:b/>
+          <w:bCs/>
+          <w:sz w:val="32"/>
+          <w:szCs w:val="32"/>
+        </w:rPr>
+        <w:t>AWS Questions:</w:t>
+      </w:r>
+    </w:p>
+    <w:p/>
+    <w:p>
+      <w:r>
+        <w:rPr>
+          <w:b/>
+          <w:bCs/>
+        </w:rPr>
+        <w:t>AWS Lambda Cold Start</w:t>
+      </w:r>
+      <w:r>
+        <w:t>: The delay when a Lambda function initializes due to container provisioning.</w:t>
+      </w:r>
+      <w:r>
+        <w:br/>
+      </w:r>
+    </w:p>
+    <w:p>
+      <w:r>
+        <w:t xml:space="preserve"> </w:t>
+      </w:r>
+      <w:r>
+        <w:rPr>
+          <w:b/>
+          <w:bCs/>
+        </w:rPr>
+        <w:t>Elastic Load Balancer (ELB) High Availability</w:t>
+      </w:r>
+      <w:r>
+        <w:t>:</w:t>
+      </w:r>
+    </w:p>
+    <w:p>
+      <w:pPr>
+        <w:numPr>
+          <w:ilvl w:val="0"/>
+          <w:numId w:val="7"/>
+        </w:numPr>
+      </w:pPr>
+      <w:r>
+        <w:t>Distributes traffic across multiple instances and Availability Zones.</w:t>
+      </w:r>
+    </w:p>
+    <w:p>
+      <w:pPr>
+        <w:numPr>
+          <w:ilvl w:val="0"/>
+          <w:numId w:val="7"/>
+        </w:numPr>
+      </w:pPr>
+      <w:r>
+        <w:t>Monitors health to reroute traffic from unhealthy targets.</w:t>
+      </w:r>
+      <w:r>
+        <w:br/>
+      </w:r>
+      <w:r>
+        <w:rPr>
+          <w:b/>
+          <w:bCs/>
+        </w:rPr>
+        <w:t>Differences</w:t>
+      </w:r>
+      <w:r>
+        <w:t>:</w:t>
+      </w:r>
+    </w:p>
+    <w:p>
+      <w:pPr>
+        <w:numPr>
+          <w:ilvl w:val="0"/>
+          <w:numId w:val="7"/>
+        </w:numPr>
+      </w:pPr>
+      <w:r>
+        <w:rPr>
+          <w:b/>
+          <w:bCs/>
+        </w:rPr>
+        <w:t>ALB</w:t>
+      </w:r>
+      <w:r>
+        <w:t> (Application Load Balancer): Layer 7, advanced routing, HTTP/HTTPS support.</w:t>
+      </w:r>
+    </w:p>
+    <w:p>
+      <w:pPr>
+        <w:numPr>
+          <w:ilvl w:val="0"/>
+          <w:numId w:val="7"/>
+        </w:numPr>
+      </w:pPr>
+      <w:r>
+        <w:rPr>
+          <w:b/>
+          <w:bCs/>
+        </w:rPr>
+        <w:t>NLB</w:t>
+      </w:r>
+      <w:r>
+        <w:t> (Network Load Balancer): Layer 4, handles TCP/UDP, low latency.</w:t>
+      </w:r>
+    </w:p>
+    <w:p>
+      <w:pPr>
+        <w:numPr>
+          <w:ilvl w:val="0"/>
+          <w:numId w:val="7"/>
+        </w:numPr>
+      </w:pPr>
+      <w:r>
+        <w:rPr>
+          <w:b/>
+          <w:bCs/>
+        </w:rPr>
+        <w:t>CLB</w:t>
+      </w:r>
+      <w:r>
+        <w:t> (Classic Load Balancer): Legacy, Layer 4/7, limited features.</w:t>
+      </w:r>
+    </w:p>
+    <w:p>
+      <w:r>
+        <w:t xml:space="preserve"> </w:t>
+      </w:r>
+      <w:r>
+        <w:rPr>
+          <w:b/>
+          <w:bCs/>
+        </w:rPr>
+        <w:t>Securely Store API Keys on EC2</w:t>
+      </w:r>
+      <w:r>
+        <w:t>:</w:t>
+      </w:r>
+    </w:p>
+    <w:p>
+      <w:pPr>
+        <w:numPr>
+          <w:ilvl w:val="0"/>
+          <w:numId w:val="8"/>
+        </w:numPr>
+      </w:pPr>
+      <w:r>
+        <w:t>Use AWS Systems Manager Parameter Store or AWS Secrets Manager.</w:t>
+      </w:r>
+    </w:p>
+    <w:p>
+      <w:pPr>
+        <w:numPr>
+          <w:ilvl w:val="0"/>
+          <w:numId w:val="8"/>
+        </w:numPr>
+      </w:pPr>
+      <w:r>
+        <w:t>Attach IAM roles with fine-grained permissions to the EC2 instance for secure access.</w:t>
+      </w:r>
+    </w:p>
+    <w:p>
+      <w:r>
+        <w:rPr>
+          <w:b/>
+          <w:bCs/>
+        </w:rPr>
+        <w:t>Troubleshoot EC2 Internet Access</w:t>
+      </w:r>
+      <w:r>
+        <w:t>:</w:t>
+      </w:r>
+    </w:p>
+    <w:p>
+      <w:pPr>
+        <w:numPr>
+          <w:ilvl w:val="0"/>
+          <w:numId w:val="9"/>
+        </w:numPr>
+      </w:pPr>
+      <w:r>
+        <w:t>Verify </w:t>
+      </w:r>
+      <w:r>
+        <w:rPr>
+          <w:b/>
+          <w:bCs/>
+        </w:rPr>
+        <w:t>route table</w:t>
+      </w:r>
+      <w:r>
+        <w:t>: Ensure route to an Internet Gateway (IGW).</w:t>
+      </w:r>
+    </w:p>
+    <w:p>
+      <w:pPr>
+        <w:numPr>
+          <w:ilvl w:val="0"/>
+          <w:numId w:val="9"/>
+        </w:numPr>
+      </w:pPr>
+      <w:r>
+        <w:t>Check </w:t>
+      </w:r>
+      <w:r>
+        <w:rPr>
+          <w:b/>
+          <w:bCs/>
+        </w:rPr>
+        <w:t>Security Groups</w:t>
+      </w:r>
+      <w:r>
+        <w:t> and </w:t>
+      </w:r>
+      <w:r>
+        <w:rPr>
+          <w:b/>
+          <w:bCs/>
+        </w:rPr>
+        <w:t>NACLs</w:t>
+      </w:r>
+      <w:r>
+        <w:t>: Allow outbound traffic (e.g., port 80/443).</w:t>
+      </w:r>
+    </w:p>
+    <w:p>
+      <w:pPr>
+        <w:numPr>
+          <w:ilvl w:val="0"/>
+          <w:numId w:val="9"/>
+        </w:numPr>
+      </w:pPr>
+      <w:r>
+        <w:t>Confirm </w:t>
+      </w:r>
+      <w:r>
+        <w:rPr>
+          <w:b/>
+          <w:bCs/>
+        </w:rPr>
+        <w:t>Elastic IP/Public IP</w:t>
+      </w:r>
+      <w:r>
+        <w:t> is assigned and correct.</w:t>
+      </w:r>
+    </w:p>
+    <w:p>
+      <w:pPr>
+        <w:numPr>
+          <w:ilvl w:val="0"/>
+          <w:numId w:val="9"/>
+        </w:numPr>
+      </w:pPr>
+      <w:r>
+        <w:t>Inspect </w:t>
+      </w:r>
+      <w:r>
+        <w:rPr>
+          <w:b/>
+          <w:bCs/>
+        </w:rPr>
+        <w:t>IGW attachment</w:t>
+      </w:r>
+      <w:r>
+        <w:t> to the VPC.</w:t>
       </w:r>
     </w:p>
     <w:p/>
@@ -286,6 +803,1049 @@
 <file path=word/numbering.xml><?xml version="1.0" encoding="utf-8"?>
 <w:numbering xmlns:wpc="http://schemas.microsoft.com/office/word/2010/wordprocessingCanvas" xmlns:cx="http://schemas.microsoft.com/office/drawing/2014/chartex" xmlns:cx1="http://schemas.microsoft.com/office/drawing/2015/9/8/chartex" xmlns:cx2="http://schemas.microsoft.com/office/drawing/2015/10/21/chartex" xmlns:cx3="http://schemas.microsoft.com/office/drawing/2016/5/9/chartex" xmlns:cx4="http://schemas.microsoft.com/office/drawing/2016/5/10/chartex" xmlns:cx5="http://schemas.microsoft.com/office/drawing/2016/5/11/chartex" xmlns:cx6="http://schemas.microsoft.com/office/drawing/2016/5/12/chartex" xmlns:cx7="http://schemas.microsoft.com/office/drawing/2016/5/13/chartex" xmlns:cx8="http://schemas.microsoft.com/office/drawing/2016/5/14/chartex" xmlns:mc="http://schemas.openxmlformats.org/markup-compatibility/2006" xmlns:aink="http://schemas.microsoft.com/office/drawing/2016/ink" xmlns:am3d="http://schemas.microsoft.com/office/drawing/2017/model3d" xmlns:o="urn:schemas-microsoft-com:office:office" xmlns:oel="http://schemas.microsoft.com/office/2019/extlst" xmlns:r="http://schemas.openxmlformats.org/officeDocument/2006/relationships" xmlns:m="http://schemas.openxmlformats.org/officeDocument/2006/math" xmlns:v="urn:schemas-microsoft-com:vml" xmlns:wp14="http://schemas.microsoft.com/office/word/2010/wordprocessingDrawing" xmlns:wp="http://schemas.openxmlformats.org/drawingml/2006/wordprocessingDrawing" xmlns:w10="urn:schemas-microsoft-com:office:word" xmlns:w="http://schemas.openxmlformats.org/wordprocessingml/2006/main" xmlns:w14="http://schemas.microsoft.com/office/word/2010/wordml" xmlns:w15="http://schemas.microsoft.com/office/word/2012/wordml" xmlns:w16cex="http://schemas.microsoft.com/office/word/2018/wordml/cex" xmlns:w16cid="http://schemas.microsoft.com/office/word/2016/wordml/cid" xmlns:w16="http://schemas.microsoft.com/office/word/2018/wordml" xmlns:w16du="http://schemas.microsoft.com/office/word/2023/wordml/word16du" xmlns:w16sdtdh="http://schemas.microsoft.com/office/word/2020/wordml/sdtdatahash" xmlns:w16se="http://schemas.microsoft.com/office/word/2015/wordml/symex" xmlns:wpg="http://schemas.microsoft.com/office/word/2010/wordprocessingGroup" xmlns:wpi="http://schemas.microsoft.com/office/word/2010/wordprocessingInk" xmlns:wne="http://schemas.microsoft.com/office/word/2006/wordml" xmlns:wps="http://schemas.microsoft.com/office/word/2010/wordprocessingShape" mc:Ignorable="w14 w15 w16se w16cid w16 w16cex w16sdtdh w16du wp14">
   <w:abstractNum w:abstractNumId="0" w15:restartNumberingAfterBreak="0">
+    <w:nsid w:val="08D330DF"/>
+    <w:multiLevelType w:val="multilevel"/>
+    <w:tmpl w:val="3198DE48"/>
+    <w:lvl w:ilvl="0">
+      <w:start w:val="1"/>
+      <w:numFmt w:val="bullet"/>
+      <w:lvlText w:val=""/>
+      <w:lvlJc w:val="left"/>
+      <w:pPr>
+        <w:tabs>
+          <w:tab w:val="num" w:pos="720"/>
+        </w:tabs>
+        <w:ind w:left="720" w:hanging="360"/>
+      </w:pPr>
+      <w:rPr>
+        <w:rFonts w:ascii="Symbol" w:hAnsi="Symbol" w:hint="default"/>
+        <w:sz w:val="20"/>
+      </w:rPr>
+    </w:lvl>
+    <w:lvl w:ilvl="1" w:tentative="1">
+      <w:start w:val="1"/>
+      <w:numFmt w:val="bullet"/>
+      <w:lvlText w:val="o"/>
+      <w:lvlJc w:val="left"/>
+      <w:pPr>
+        <w:tabs>
+          <w:tab w:val="num" w:pos="1440"/>
+        </w:tabs>
+        <w:ind w:left="1440" w:hanging="360"/>
+      </w:pPr>
+      <w:rPr>
+        <w:rFonts w:ascii="Courier New" w:hAnsi="Courier New" w:hint="default"/>
+        <w:sz w:val="20"/>
+      </w:rPr>
+    </w:lvl>
+    <w:lvl w:ilvl="2" w:tentative="1">
+      <w:start w:val="1"/>
+      <w:numFmt w:val="bullet"/>
+      <w:lvlText w:val=""/>
+      <w:lvlJc w:val="left"/>
+      <w:pPr>
+        <w:tabs>
+          <w:tab w:val="num" w:pos="2160"/>
+        </w:tabs>
+        <w:ind w:left="2160" w:hanging="360"/>
+      </w:pPr>
+      <w:rPr>
+        <w:rFonts w:ascii="Wingdings" w:hAnsi="Wingdings" w:hint="default"/>
+        <w:sz w:val="20"/>
+      </w:rPr>
+    </w:lvl>
+    <w:lvl w:ilvl="3" w:tentative="1">
+      <w:start w:val="1"/>
+      <w:numFmt w:val="bullet"/>
+      <w:lvlText w:val=""/>
+      <w:lvlJc w:val="left"/>
+      <w:pPr>
+        <w:tabs>
+          <w:tab w:val="num" w:pos="2880"/>
+        </w:tabs>
+        <w:ind w:left="2880" w:hanging="360"/>
+      </w:pPr>
+      <w:rPr>
+        <w:rFonts w:ascii="Wingdings" w:hAnsi="Wingdings" w:hint="default"/>
+        <w:sz w:val="20"/>
+      </w:rPr>
+    </w:lvl>
+    <w:lvl w:ilvl="4" w:tentative="1">
+      <w:start w:val="1"/>
+      <w:numFmt w:val="bullet"/>
+      <w:lvlText w:val=""/>
+      <w:lvlJc w:val="left"/>
+      <w:pPr>
+        <w:tabs>
+          <w:tab w:val="num" w:pos="3600"/>
+        </w:tabs>
+        <w:ind w:left="3600" w:hanging="360"/>
+      </w:pPr>
+      <w:rPr>
+        <w:rFonts w:ascii="Wingdings" w:hAnsi="Wingdings" w:hint="default"/>
+        <w:sz w:val="20"/>
+      </w:rPr>
+    </w:lvl>
+    <w:lvl w:ilvl="5" w:tentative="1">
+      <w:start w:val="1"/>
+      <w:numFmt w:val="bullet"/>
+      <w:lvlText w:val=""/>
+      <w:lvlJc w:val="left"/>
+      <w:pPr>
+        <w:tabs>
+          <w:tab w:val="num" w:pos="4320"/>
+        </w:tabs>
+        <w:ind w:left="4320" w:hanging="360"/>
+      </w:pPr>
+      <w:rPr>
+        <w:rFonts w:ascii="Wingdings" w:hAnsi="Wingdings" w:hint="default"/>
+        <w:sz w:val="20"/>
+      </w:rPr>
+    </w:lvl>
+    <w:lvl w:ilvl="6" w:tentative="1">
+      <w:start w:val="1"/>
+      <w:numFmt w:val="bullet"/>
+      <w:lvlText w:val=""/>
+      <w:lvlJc w:val="left"/>
+      <w:pPr>
+        <w:tabs>
+          <w:tab w:val="num" w:pos="5040"/>
+        </w:tabs>
+        <w:ind w:left="5040" w:hanging="360"/>
+      </w:pPr>
+      <w:rPr>
+        <w:rFonts w:ascii="Wingdings" w:hAnsi="Wingdings" w:hint="default"/>
+        <w:sz w:val="20"/>
+      </w:rPr>
+    </w:lvl>
+    <w:lvl w:ilvl="7" w:tentative="1">
+      <w:start w:val="1"/>
+      <w:numFmt w:val="bullet"/>
+      <w:lvlText w:val=""/>
+      <w:lvlJc w:val="left"/>
+      <w:pPr>
+        <w:tabs>
+          <w:tab w:val="num" w:pos="5760"/>
+        </w:tabs>
+        <w:ind w:left="5760" w:hanging="360"/>
+      </w:pPr>
+      <w:rPr>
+        <w:rFonts w:ascii="Wingdings" w:hAnsi="Wingdings" w:hint="default"/>
+        <w:sz w:val="20"/>
+      </w:rPr>
+    </w:lvl>
+    <w:lvl w:ilvl="8" w:tentative="1">
+      <w:start w:val="1"/>
+      <w:numFmt w:val="bullet"/>
+      <w:lvlText w:val=""/>
+      <w:lvlJc w:val="left"/>
+      <w:pPr>
+        <w:tabs>
+          <w:tab w:val="num" w:pos="6480"/>
+        </w:tabs>
+        <w:ind w:left="6480" w:hanging="360"/>
+      </w:pPr>
+      <w:rPr>
+        <w:rFonts w:ascii="Wingdings" w:hAnsi="Wingdings" w:hint="default"/>
+        <w:sz w:val="20"/>
+      </w:rPr>
+    </w:lvl>
+  </w:abstractNum>
+  <w:abstractNum w:abstractNumId="1" w15:restartNumberingAfterBreak="0">
+    <w:nsid w:val="22FE2A41"/>
+    <w:multiLevelType w:val="multilevel"/>
+    <w:tmpl w:val="5F9C4ED8"/>
+    <w:lvl w:ilvl="0">
+      <w:start w:val="1"/>
+      <w:numFmt w:val="bullet"/>
+      <w:lvlText w:val=""/>
+      <w:lvlJc w:val="left"/>
+      <w:pPr>
+        <w:tabs>
+          <w:tab w:val="num" w:pos="720"/>
+        </w:tabs>
+        <w:ind w:left="720" w:hanging="360"/>
+      </w:pPr>
+      <w:rPr>
+        <w:rFonts w:ascii="Symbol" w:hAnsi="Symbol" w:hint="default"/>
+        <w:sz w:val="20"/>
+      </w:rPr>
+    </w:lvl>
+    <w:lvl w:ilvl="1" w:tentative="1">
+      <w:start w:val="1"/>
+      <w:numFmt w:val="bullet"/>
+      <w:lvlText w:val="o"/>
+      <w:lvlJc w:val="left"/>
+      <w:pPr>
+        <w:tabs>
+          <w:tab w:val="num" w:pos="1440"/>
+        </w:tabs>
+        <w:ind w:left="1440" w:hanging="360"/>
+      </w:pPr>
+      <w:rPr>
+        <w:rFonts w:ascii="Courier New" w:hAnsi="Courier New" w:hint="default"/>
+        <w:sz w:val="20"/>
+      </w:rPr>
+    </w:lvl>
+    <w:lvl w:ilvl="2" w:tentative="1">
+      <w:start w:val="1"/>
+      <w:numFmt w:val="bullet"/>
+      <w:lvlText w:val=""/>
+      <w:lvlJc w:val="left"/>
+      <w:pPr>
+        <w:tabs>
+          <w:tab w:val="num" w:pos="2160"/>
+        </w:tabs>
+        <w:ind w:left="2160" w:hanging="360"/>
+      </w:pPr>
+      <w:rPr>
+        <w:rFonts w:ascii="Wingdings" w:hAnsi="Wingdings" w:hint="default"/>
+        <w:sz w:val="20"/>
+      </w:rPr>
+    </w:lvl>
+    <w:lvl w:ilvl="3" w:tentative="1">
+      <w:start w:val="1"/>
+      <w:numFmt w:val="bullet"/>
+      <w:lvlText w:val=""/>
+      <w:lvlJc w:val="left"/>
+      <w:pPr>
+        <w:tabs>
+          <w:tab w:val="num" w:pos="2880"/>
+        </w:tabs>
+        <w:ind w:left="2880" w:hanging="360"/>
+      </w:pPr>
+      <w:rPr>
+        <w:rFonts w:ascii="Wingdings" w:hAnsi="Wingdings" w:hint="default"/>
+        <w:sz w:val="20"/>
+      </w:rPr>
+    </w:lvl>
+    <w:lvl w:ilvl="4" w:tentative="1">
+      <w:start w:val="1"/>
+      <w:numFmt w:val="bullet"/>
+      <w:lvlText w:val=""/>
+      <w:lvlJc w:val="left"/>
+      <w:pPr>
+        <w:tabs>
+          <w:tab w:val="num" w:pos="3600"/>
+        </w:tabs>
+        <w:ind w:left="3600" w:hanging="360"/>
+      </w:pPr>
+      <w:rPr>
+        <w:rFonts w:ascii="Wingdings" w:hAnsi="Wingdings" w:hint="default"/>
+        <w:sz w:val="20"/>
+      </w:rPr>
+    </w:lvl>
+    <w:lvl w:ilvl="5" w:tentative="1">
+      <w:start w:val="1"/>
+      <w:numFmt w:val="bullet"/>
+      <w:lvlText w:val=""/>
+      <w:lvlJc w:val="left"/>
+      <w:pPr>
+        <w:tabs>
+          <w:tab w:val="num" w:pos="4320"/>
+        </w:tabs>
+        <w:ind w:left="4320" w:hanging="360"/>
+      </w:pPr>
+      <w:rPr>
+        <w:rFonts w:ascii="Wingdings" w:hAnsi="Wingdings" w:hint="default"/>
+        <w:sz w:val="20"/>
+      </w:rPr>
+    </w:lvl>
+    <w:lvl w:ilvl="6" w:tentative="1">
+      <w:start w:val="1"/>
+      <w:numFmt w:val="bullet"/>
+      <w:lvlText w:val=""/>
+      <w:lvlJc w:val="left"/>
+      <w:pPr>
+        <w:tabs>
+          <w:tab w:val="num" w:pos="5040"/>
+        </w:tabs>
+        <w:ind w:left="5040" w:hanging="360"/>
+      </w:pPr>
+      <w:rPr>
+        <w:rFonts w:ascii="Wingdings" w:hAnsi="Wingdings" w:hint="default"/>
+        <w:sz w:val="20"/>
+      </w:rPr>
+    </w:lvl>
+    <w:lvl w:ilvl="7" w:tentative="1">
+      <w:start w:val="1"/>
+      <w:numFmt w:val="bullet"/>
+      <w:lvlText w:val=""/>
+      <w:lvlJc w:val="left"/>
+      <w:pPr>
+        <w:tabs>
+          <w:tab w:val="num" w:pos="5760"/>
+        </w:tabs>
+        <w:ind w:left="5760" w:hanging="360"/>
+      </w:pPr>
+      <w:rPr>
+        <w:rFonts w:ascii="Wingdings" w:hAnsi="Wingdings" w:hint="default"/>
+        <w:sz w:val="20"/>
+      </w:rPr>
+    </w:lvl>
+    <w:lvl w:ilvl="8" w:tentative="1">
+      <w:start w:val="1"/>
+      <w:numFmt w:val="bullet"/>
+      <w:lvlText w:val=""/>
+      <w:lvlJc w:val="left"/>
+      <w:pPr>
+        <w:tabs>
+          <w:tab w:val="num" w:pos="6480"/>
+        </w:tabs>
+        <w:ind w:left="6480" w:hanging="360"/>
+      </w:pPr>
+      <w:rPr>
+        <w:rFonts w:ascii="Wingdings" w:hAnsi="Wingdings" w:hint="default"/>
+        <w:sz w:val="20"/>
+      </w:rPr>
+    </w:lvl>
+  </w:abstractNum>
+  <w:abstractNum w:abstractNumId="2" w15:restartNumberingAfterBreak="0">
+    <w:nsid w:val="31C466D8"/>
+    <w:multiLevelType w:val="multilevel"/>
+    <w:tmpl w:val="5498DB62"/>
+    <w:lvl w:ilvl="0">
+      <w:start w:val="1"/>
+      <w:numFmt w:val="bullet"/>
+      <w:lvlText w:val=""/>
+      <w:lvlJc w:val="left"/>
+      <w:pPr>
+        <w:tabs>
+          <w:tab w:val="num" w:pos="720"/>
+        </w:tabs>
+        <w:ind w:left="720" w:hanging="360"/>
+      </w:pPr>
+      <w:rPr>
+        <w:rFonts w:ascii="Symbol" w:hAnsi="Symbol" w:hint="default"/>
+        <w:sz w:val="20"/>
+      </w:rPr>
+    </w:lvl>
+    <w:lvl w:ilvl="1" w:tentative="1">
+      <w:start w:val="1"/>
+      <w:numFmt w:val="bullet"/>
+      <w:lvlText w:val="o"/>
+      <w:lvlJc w:val="left"/>
+      <w:pPr>
+        <w:tabs>
+          <w:tab w:val="num" w:pos="1440"/>
+        </w:tabs>
+        <w:ind w:left="1440" w:hanging="360"/>
+      </w:pPr>
+      <w:rPr>
+        <w:rFonts w:ascii="Courier New" w:hAnsi="Courier New" w:hint="default"/>
+        <w:sz w:val="20"/>
+      </w:rPr>
+    </w:lvl>
+    <w:lvl w:ilvl="2" w:tentative="1">
+      <w:start w:val="1"/>
+      <w:numFmt w:val="bullet"/>
+      <w:lvlText w:val=""/>
+      <w:lvlJc w:val="left"/>
+      <w:pPr>
+        <w:tabs>
+          <w:tab w:val="num" w:pos="2160"/>
+        </w:tabs>
+        <w:ind w:left="2160" w:hanging="360"/>
+      </w:pPr>
+      <w:rPr>
+        <w:rFonts w:ascii="Wingdings" w:hAnsi="Wingdings" w:hint="default"/>
+        <w:sz w:val="20"/>
+      </w:rPr>
+    </w:lvl>
+    <w:lvl w:ilvl="3" w:tentative="1">
+      <w:start w:val="1"/>
+      <w:numFmt w:val="bullet"/>
+      <w:lvlText w:val=""/>
+      <w:lvlJc w:val="left"/>
+      <w:pPr>
+        <w:tabs>
+          <w:tab w:val="num" w:pos="2880"/>
+        </w:tabs>
+        <w:ind w:left="2880" w:hanging="360"/>
+      </w:pPr>
+      <w:rPr>
+        <w:rFonts w:ascii="Wingdings" w:hAnsi="Wingdings" w:hint="default"/>
+        <w:sz w:val="20"/>
+      </w:rPr>
+    </w:lvl>
+    <w:lvl w:ilvl="4" w:tentative="1">
+      <w:start w:val="1"/>
+      <w:numFmt w:val="bullet"/>
+      <w:lvlText w:val=""/>
+      <w:lvlJc w:val="left"/>
+      <w:pPr>
+        <w:tabs>
+          <w:tab w:val="num" w:pos="3600"/>
+        </w:tabs>
+        <w:ind w:left="3600" w:hanging="360"/>
+      </w:pPr>
+      <w:rPr>
+        <w:rFonts w:ascii="Wingdings" w:hAnsi="Wingdings" w:hint="default"/>
+        <w:sz w:val="20"/>
+      </w:rPr>
+    </w:lvl>
+    <w:lvl w:ilvl="5" w:tentative="1">
+      <w:start w:val="1"/>
+      <w:numFmt w:val="bullet"/>
+      <w:lvlText w:val=""/>
+      <w:lvlJc w:val="left"/>
+      <w:pPr>
+        <w:tabs>
+          <w:tab w:val="num" w:pos="4320"/>
+        </w:tabs>
+        <w:ind w:left="4320" w:hanging="360"/>
+      </w:pPr>
+      <w:rPr>
+        <w:rFonts w:ascii="Wingdings" w:hAnsi="Wingdings" w:hint="default"/>
+        <w:sz w:val="20"/>
+      </w:rPr>
+    </w:lvl>
+    <w:lvl w:ilvl="6" w:tentative="1">
+      <w:start w:val="1"/>
+      <w:numFmt w:val="bullet"/>
+      <w:lvlText w:val=""/>
+      <w:lvlJc w:val="left"/>
+      <w:pPr>
+        <w:tabs>
+          <w:tab w:val="num" w:pos="5040"/>
+        </w:tabs>
+        <w:ind w:left="5040" w:hanging="360"/>
+      </w:pPr>
+      <w:rPr>
+        <w:rFonts w:ascii="Wingdings" w:hAnsi="Wingdings" w:hint="default"/>
+        <w:sz w:val="20"/>
+      </w:rPr>
+    </w:lvl>
+    <w:lvl w:ilvl="7" w:tentative="1">
+      <w:start w:val="1"/>
+      <w:numFmt w:val="bullet"/>
+      <w:lvlText w:val=""/>
+      <w:lvlJc w:val="left"/>
+      <w:pPr>
+        <w:tabs>
+          <w:tab w:val="num" w:pos="5760"/>
+        </w:tabs>
+        <w:ind w:left="5760" w:hanging="360"/>
+      </w:pPr>
+      <w:rPr>
+        <w:rFonts w:ascii="Wingdings" w:hAnsi="Wingdings" w:hint="default"/>
+        <w:sz w:val="20"/>
+      </w:rPr>
+    </w:lvl>
+    <w:lvl w:ilvl="8" w:tentative="1">
+      <w:start w:val="1"/>
+      <w:numFmt w:val="bullet"/>
+      <w:lvlText w:val=""/>
+      <w:lvlJc w:val="left"/>
+      <w:pPr>
+        <w:tabs>
+          <w:tab w:val="num" w:pos="6480"/>
+        </w:tabs>
+        <w:ind w:left="6480" w:hanging="360"/>
+      </w:pPr>
+      <w:rPr>
+        <w:rFonts w:ascii="Wingdings" w:hAnsi="Wingdings" w:hint="default"/>
+        <w:sz w:val="20"/>
+      </w:rPr>
+    </w:lvl>
+  </w:abstractNum>
+  <w:abstractNum w:abstractNumId="3" w15:restartNumberingAfterBreak="0">
+    <w:nsid w:val="3BDE030C"/>
+    <w:multiLevelType w:val="multilevel"/>
+    <w:tmpl w:val="22767E7A"/>
+    <w:lvl w:ilvl="0">
+      <w:start w:val="1"/>
+      <w:numFmt w:val="bullet"/>
+      <w:lvlText w:val=""/>
+      <w:lvlJc w:val="left"/>
+      <w:pPr>
+        <w:tabs>
+          <w:tab w:val="num" w:pos="720"/>
+        </w:tabs>
+        <w:ind w:left="720" w:hanging="360"/>
+      </w:pPr>
+      <w:rPr>
+        <w:rFonts w:ascii="Symbol" w:hAnsi="Symbol" w:hint="default"/>
+        <w:sz w:val="20"/>
+      </w:rPr>
+    </w:lvl>
+    <w:lvl w:ilvl="1" w:tentative="1">
+      <w:start w:val="1"/>
+      <w:numFmt w:val="bullet"/>
+      <w:lvlText w:val="o"/>
+      <w:lvlJc w:val="left"/>
+      <w:pPr>
+        <w:tabs>
+          <w:tab w:val="num" w:pos="1440"/>
+        </w:tabs>
+        <w:ind w:left="1440" w:hanging="360"/>
+      </w:pPr>
+      <w:rPr>
+        <w:rFonts w:ascii="Courier New" w:hAnsi="Courier New" w:hint="default"/>
+        <w:sz w:val="20"/>
+      </w:rPr>
+    </w:lvl>
+    <w:lvl w:ilvl="2" w:tentative="1">
+      <w:start w:val="1"/>
+      <w:numFmt w:val="bullet"/>
+      <w:lvlText w:val=""/>
+      <w:lvlJc w:val="left"/>
+      <w:pPr>
+        <w:tabs>
+          <w:tab w:val="num" w:pos="2160"/>
+        </w:tabs>
+        <w:ind w:left="2160" w:hanging="360"/>
+      </w:pPr>
+      <w:rPr>
+        <w:rFonts w:ascii="Wingdings" w:hAnsi="Wingdings" w:hint="default"/>
+        <w:sz w:val="20"/>
+      </w:rPr>
+    </w:lvl>
+    <w:lvl w:ilvl="3" w:tentative="1">
+      <w:start w:val="1"/>
+      <w:numFmt w:val="bullet"/>
+      <w:lvlText w:val=""/>
+      <w:lvlJc w:val="left"/>
+      <w:pPr>
+        <w:tabs>
+          <w:tab w:val="num" w:pos="2880"/>
+        </w:tabs>
+        <w:ind w:left="2880" w:hanging="360"/>
+      </w:pPr>
+      <w:rPr>
+        <w:rFonts w:ascii="Wingdings" w:hAnsi="Wingdings" w:hint="default"/>
+        <w:sz w:val="20"/>
+      </w:rPr>
+    </w:lvl>
+    <w:lvl w:ilvl="4" w:tentative="1">
+      <w:start w:val="1"/>
+      <w:numFmt w:val="bullet"/>
+      <w:lvlText w:val=""/>
+      <w:lvlJc w:val="left"/>
+      <w:pPr>
+        <w:tabs>
+          <w:tab w:val="num" w:pos="3600"/>
+        </w:tabs>
+        <w:ind w:left="3600" w:hanging="360"/>
+      </w:pPr>
+      <w:rPr>
+        <w:rFonts w:ascii="Wingdings" w:hAnsi="Wingdings" w:hint="default"/>
+        <w:sz w:val="20"/>
+      </w:rPr>
+    </w:lvl>
+    <w:lvl w:ilvl="5" w:tentative="1">
+      <w:start w:val="1"/>
+      <w:numFmt w:val="bullet"/>
+      <w:lvlText w:val=""/>
+      <w:lvlJc w:val="left"/>
+      <w:pPr>
+        <w:tabs>
+          <w:tab w:val="num" w:pos="4320"/>
+        </w:tabs>
+        <w:ind w:left="4320" w:hanging="360"/>
+      </w:pPr>
+      <w:rPr>
+        <w:rFonts w:ascii="Wingdings" w:hAnsi="Wingdings" w:hint="default"/>
+        <w:sz w:val="20"/>
+      </w:rPr>
+    </w:lvl>
+    <w:lvl w:ilvl="6" w:tentative="1">
+      <w:start w:val="1"/>
+      <w:numFmt w:val="bullet"/>
+      <w:lvlText w:val=""/>
+      <w:lvlJc w:val="left"/>
+      <w:pPr>
+        <w:tabs>
+          <w:tab w:val="num" w:pos="5040"/>
+        </w:tabs>
+        <w:ind w:left="5040" w:hanging="360"/>
+      </w:pPr>
+      <w:rPr>
+        <w:rFonts w:ascii="Wingdings" w:hAnsi="Wingdings" w:hint="default"/>
+        <w:sz w:val="20"/>
+      </w:rPr>
+    </w:lvl>
+    <w:lvl w:ilvl="7" w:tentative="1">
+      <w:start w:val="1"/>
+      <w:numFmt w:val="bullet"/>
+      <w:lvlText w:val=""/>
+      <w:lvlJc w:val="left"/>
+      <w:pPr>
+        <w:tabs>
+          <w:tab w:val="num" w:pos="5760"/>
+        </w:tabs>
+        <w:ind w:left="5760" w:hanging="360"/>
+      </w:pPr>
+      <w:rPr>
+        <w:rFonts w:ascii="Wingdings" w:hAnsi="Wingdings" w:hint="default"/>
+        <w:sz w:val="20"/>
+      </w:rPr>
+    </w:lvl>
+    <w:lvl w:ilvl="8" w:tentative="1">
+      <w:start w:val="1"/>
+      <w:numFmt w:val="bullet"/>
+      <w:lvlText w:val=""/>
+      <w:lvlJc w:val="left"/>
+      <w:pPr>
+        <w:tabs>
+          <w:tab w:val="num" w:pos="6480"/>
+        </w:tabs>
+        <w:ind w:left="6480" w:hanging="360"/>
+      </w:pPr>
+      <w:rPr>
+        <w:rFonts w:ascii="Wingdings" w:hAnsi="Wingdings" w:hint="default"/>
+        <w:sz w:val="20"/>
+      </w:rPr>
+    </w:lvl>
+  </w:abstractNum>
+  <w:abstractNum w:abstractNumId="4" w15:restartNumberingAfterBreak="0">
+    <w:nsid w:val="5AF23D6E"/>
+    <w:multiLevelType w:val="multilevel"/>
+    <w:tmpl w:val="D75EDBB8"/>
+    <w:lvl w:ilvl="0">
+      <w:start w:val="1"/>
+      <w:numFmt w:val="bullet"/>
+      <w:lvlText w:val=""/>
+      <w:lvlJc w:val="left"/>
+      <w:pPr>
+        <w:tabs>
+          <w:tab w:val="num" w:pos="720"/>
+        </w:tabs>
+        <w:ind w:left="720" w:hanging="360"/>
+      </w:pPr>
+      <w:rPr>
+        <w:rFonts w:ascii="Symbol" w:hAnsi="Symbol" w:hint="default"/>
+        <w:sz w:val="20"/>
+      </w:rPr>
+    </w:lvl>
+    <w:lvl w:ilvl="1" w:tentative="1">
+      <w:start w:val="1"/>
+      <w:numFmt w:val="bullet"/>
+      <w:lvlText w:val="o"/>
+      <w:lvlJc w:val="left"/>
+      <w:pPr>
+        <w:tabs>
+          <w:tab w:val="num" w:pos="1440"/>
+        </w:tabs>
+        <w:ind w:left="1440" w:hanging="360"/>
+      </w:pPr>
+      <w:rPr>
+        <w:rFonts w:ascii="Courier New" w:hAnsi="Courier New" w:hint="default"/>
+        <w:sz w:val="20"/>
+      </w:rPr>
+    </w:lvl>
+    <w:lvl w:ilvl="2" w:tentative="1">
+      <w:start w:val="1"/>
+      <w:numFmt w:val="bullet"/>
+      <w:lvlText w:val=""/>
+      <w:lvlJc w:val="left"/>
+      <w:pPr>
+        <w:tabs>
+          <w:tab w:val="num" w:pos="2160"/>
+        </w:tabs>
+        <w:ind w:left="2160" w:hanging="360"/>
+      </w:pPr>
+      <w:rPr>
+        <w:rFonts w:ascii="Wingdings" w:hAnsi="Wingdings" w:hint="default"/>
+        <w:sz w:val="20"/>
+      </w:rPr>
+    </w:lvl>
+    <w:lvl w:ilvl="3" w:tentative="1">
+      <w:start w:val="1"/>
+      <w:numFmt w:val="bullet"/>
+      <w:lvlText w:val=""/>
+      <w:lvlJc w:val="left"/>
+      <w:pPr>
+        <w:tabs>
+          <w:tab w:val="num" w:pos="2880"/>
+        </w:tabs>
+        <w:ind w:left="2880" w:hanging="360"/>
+      </w:pPr>
+      <w:rPr>
+        <w:rFonts w:ascii="Wingdings" w:hAnsi="Wingdings" w:hint="default"/>
+        <w:sz w:val="20"/>
+      </w:rPr>
+    </w:lvl>
+    <w:lvl w:ilvl="4" w:tentative="1">
+      <w:start w:val="1"/>
+      <w:numFmt w:val="bullet"/>
+      <w:lvlText w:val=""/>
+      <w:lvlJc w:val="left"/>
+      <w:pPr>
+        <w:tabs>
+          <w:tab w:val="num" w:pos="3600"/>
+        </w:tabs>
+        <w:ind w:left="3600" w:hanging="360"/>
+      </w:pPr>
+      <w:rPr>
+        <w:rFonts w:ascii="Wingdings" w:hAnsi="Wingdings" w:hint="default"/>
+        <w:sz w:val="20"/>
+      </w:rPr>
+    </w:lvl>
+    <w:lvl w:ilvl="5" w:tentative="1">
+      <w:start w:val="1"/>
+      <w:numFmt w:val="bullet"/>
+      <w:lvlText w:val=""/>
+      <w:lvlJc w:val="left"/>
+      <w:pPr>
+        <w:tabs>
+          <w:tab w:val="num" w:pos="4320"/>
+        </w:tabs>
+        <w:ind w:left="4320" w:hanging="360"/>
+      </w:pPr>
+      <w:rPr>
+        <w:rFonts w:ascii="Wingdings" w:hAnsi="Wingdings" w:hint="default"/>
+        <w:sz w:val="20"/>
+      </w:rPr>
+    </w:lvl>
+    <w:lvl w:ilvl="6" w:tentative="1">
+      <w:start w:val="1"/>
+      <w:numFmt w:val="bullet"/>
+      <w:lvlText w:val=""/>
+      <w:lvlJc w:val="left"/>
+      <w:pPr>
+        <w:tabs>
+          <w:tab w:val="num" w:pos="5040"/>
+        </w:tabs>
+        <w:ind w:left="5040" w:hanging="360"/>
+      </w:pPr>
+      <w:rPr>
+        <w:rFonts w:ascii="Wingdings" w:hAnsi="Wingdings" w:hint="default"/>
+        <w:sz w:val="20"/>
+      </w:rPr>
+    </w:lvl>
+    <w:lvl w:ilvl="7" w:tentative="1">
+      <w:start w:val="1"/>
+      <w:numFmt w:val="bullet"/>
+      <w:lvlText w:val=""/>
+      <w:lvlJc w:val="left"/>
+      <w:pPr>
+        <w:tabs>
+          <w:tab w:val="num" w:pos="5760"/>
+        </w:tabs>
+        <w:ind w:left="5760" w:hanging="360"/>
+      </w:pPr>
+      <w:rPr>
+        <w:rFonts w:ascii="Wingdings" w:hAnsi="Wingdings" w:hint="default"/>
+        <w:sz w:val="20"/>
+      </w:rPr>
+    </w:lvl>
+    <w:lvl w:ilvl="8" w:tentative="1">
+      <w:start w:val="1"/>
+      <w:numFmt w:val="bullet"/>
+      <w:lvlText w:val=""/>
+      <w:lvlJc w:val="left"/>
+      <w:pPr>
+        <w:tabs>
+          <w:tab w:val="num" w:pos="6480"/>
+        </w:tabs>
+        <w:ind w:left="6480" w:hanging="360"/>
+      </w:pPr>
+      <w:rPr>
+        <w:rFonts w:ascii="Wingdings" w:hAnsi="Wingdings" w:hint="default"/>
+        <w:sz w:val="20"/>
+      </w:rPr>
+    </w:lvl>
+  </w:abstractNum>
+  <w:abstractNum w:abstractNumId="5" w15:restartNumberingAfterBreak="0">
+    <w:nsid w:val="6B0C7FB7"/>
+    <w:multiLevelType w:val="multilevel"/>
+    <w:tmpl w:val="A4246768"/>
+    <w:lvl w:ilvl="0">
+      <w:start w:val="1"/>
+      <w:numFmt w:val="bullet"/>
+      <w:lvlText w:val=""/>
+      <w:lvlJc w:val="left"/>
+      <w:pPr>
+        <w:tabs>
+          <w:tab w:val="num" w:pos="720"/>
+        </w:tabs>
+        <w:ind w:left="720" w:hanging="360"/>
+      </w:pPr>
+      <w:rPr>
+        <w:rFonts w:ascii="Symbol" w:hAnsi="Symbol" w:hint="default"/>
+        <w:sz w:val="20"/>
+      </w:rPr>
+    </w:lvl>
+    <w:lvl w:ilvl="1" w:tentative="1">
+      <w:start w:val="1"/>
+      <w:numFmt w:val="bullet"/>
+      <w:lvlText w:val="o"/>
+      <w:lvlJc w:val="left"/>
+      <w:pPr>
+        <w:tabs>
+          <w:tab w:val="num" w:pos="1440"/>
+        </w:tabs>
+        <w:ind w:left="1440" w:hanging="360"/>
+      </w:pPr>
+      <w:rPr>
+        <w:rFonts w:ascii="Courier New" w:hAnsi="Courier New" w:hint="default"/>
+        <w:sz w:val="20"/>
+      </w:rPr>
+    </w:lvl>
+    <w:lvl w:ilvl="2" w:tentative="1">
+      <w:start w:val="1"/>
+      <w:numFmt w:val="bullet"/>
+      <w:lvlText w:val=""/>
+      <w:lvlJc w:val="left"/>
+      <w:pPr>
+        <w:tabs>
+          <w:tab w:val="num" w:pos="2160"/>
+        </w:tabs>
+        <w:ind w:left="2160" w:hanging="360"/>
+      </w:pPr>
+      <w:rPr>
+        <w:rFonts w:ascii="Wingdings" w:hAnsi="Wingdings" w:hint="default"/>
+        <w:sz w:val="20"/>
+      </w:rPr>
+    </w:lvl>
+    <w:lvl w:ilvl="3" w:tentative="1">
+      <w:start w:val="1"/>
+      <w:numFmt w:val="bullet"/>
+      <w:lvlText w:val=""/>
+      <w:lvlJc w:val="left"/>
+      <w:pPr>
+        <w:tabs>
+          <w:tab w:val="num" w:pos="2880"/>
+        </w:tabs>
+        <w:ind w:left="2880" w:hanging="360"/>
+      </w:pPr>
+      <w:rPr>
+        <w:rFonts w:ascii="Wingdings" w:hAnsi="Wingdings" w:hint="default"/>
+        <w:sz w:val="20"/>
+      </w:rPr>
+    </w:lvl>
+    <w:lvl w:ilvl="4" w:tentative="1">
+      <w:start w:val="1"/>
+      <w:numFmt w:val="bullet"/>
+      <w:lvlText w:val=""/>
+      <w:lvlJc w:val="left"/>
+      <w:pPr>
+        <w:tabs>
+          <w:tab w:val="num" w:pos="3600"/>
+        </w:tabs>
+        <w:ind w:left="3600" w:hanging="360"/>
+      </w:pPr>
+      <w:rPr>
+        <w:rFonts w:ascii="Wingdings" w:hAnsi="Wingdings" w:hint="default"/>
+        <w:sz w:val="20"/>
+      </w:rPr>
+    </w:lvl>
+    <w:lvl w:ilvl="5" w:tentative="1">
+      <w:start w:val="1"/>
+      <w:numFmt w:val="bullet"/>
+      <w:lvlText w:val=""/>
+      <w:lvlJc w:val="left"/>
+      <w:pPr>
+        <w:tabs>
+          <w:tab w:val="num" w:pos="4320"/>
+        </w:tabs>
+        <w:ind w:left="4320" w:hanging="360"/>
+      </w:pPr>
+      <w:rPr>
+        <w:rFonts w:ascii="Wingdings" w:hAnsi="Wingdings" w:hint="default"/>
+        <w:sz w:val="20"/>
+      </w:rPr>
+    </w:lvl>
+    <w:lvl w:ilvl="6" w:tentative="1">
+      <w:start w:val="1"/>
+      <w:numFmt w:val="bullet"/>
+      <w:lvlText w:val=""/>
+      <w:lvlJc w:val="left"/>
+      <w:pPr>
+        <w:tabs>
+          <w:tab w:val="num" w:pos="5040"/>
+        </w:tabs>
+        <w:ind w:left="5040" w:hanging="360"/>
+      </w:pPr>
+      <w:rPr>
+        <w:rFonts w:ascii="Wingdings" w:hAnsi="Wingdings" w:hint="default"/>
+        <w:sz w:val="20"/>
+      </w:rPr>
+    </w:lvl>
+    <w:lvl w:ilvl="7" w:tentative="1">
+      <w:start w:val="1"/>
+      <w:numFmt w:val="bullet"/>
+      <w:lvlText w:val=""/>
+      <w:lvlJc w:val="left"/>
+      <w:pPr>
+        <w:tabs>
+          <w:tab w:val="num" w:pos="5760"/>
+        </w:tabs>
+        <w:ind w:left="5760" w:hanging="360"/>
+      </w:pPr>
+      <w:rPr>
+        <w:rFonts w:ascii="Wingdings" w:hAnsi="Wingdings" w:hint="default"/>
+        <w:sz w:val="20"/>
+      </w:rPr>
+    </w:lvl>
+    <w:lvl w:ilvl="8" w:tentative="1">
+      <w:start w:val="1"/>
+      <w:numFmt w:val="bullet"/>
+      <w:lvlText w:val=""/>
+      <w:lvlJc w:val="left"/>
+      <w:pPr>
+        <w:tabs>
+          <w:tab w:val="num" w:pos="6480"/>
+        </w:tabs>
+        <w:ind w:left="6480" w:hanging="360"/>
+      </w:pPr>
+      <w:rPr>
+        <w:rFonts w:ascii="Wingdings" w:hAnsi="Wingdings" w:hint="default"/>
+        <w:sz w:val="20"/>
+      </w:rPr>
+    </w:lvl>
+  </w:abstractNum>
+  <w:abstractNum w:abstractNumId="6" w15:restartNumberingAfterBreak="0">
+    <w:nsid w:val="6C8E64B4"/>
+    <w:multiLevelType w:val="multilevel"/>
+    <w:tmpl w:val="37F63DC0"/>
+    <w:lvl w:ilvl="0">
+      <w:start w:val="1"/>
+      <w:numFmt w:val="bullet"/>
+      <w:lvlText w:val=""/>
+      <w:lvlJc w:val="left"/>
+      <w:pPr>
+        <w:tabs>
+          <w:tab w:val="num" w:pos="720"/>
+        </w:tabs>
+        <w:ind w:left="720" w:hanging="360"/>
+      </w:pPr>
+      <w:rPr>
+        <w:rFonts w:ascii="Symbol" w:hAnsi="Symbol" w:hint="default"/>
+        <w:sz w:val="20"/>
+      </w:rPr>
+    </w:lvl>
+    <w:lvl w:ilvl="1" w:tentative="1">
+      <w:start w:val="1"/>
+      <w:numFmt w:val="bullet"/>
+      <w:lvlText w:val="o"/>
+      <w:lvlJc w:val="left"/>
+      <w:pPr>
+        <w:tabs>
+          <w:tab w:val="num" w:pos="1440"/>
+        </w:tabs>
+        <w:ind w:left="1440" w:hanging="360"/>
+      </w:pPr>
+      <w:rPr>
+        <w:rFonts w:ascii="Courier New" w:hAnsi="Courier New" w:hint="default"/>
+        <w:sz w:val="20"/>
+      </w:rPr>
+    </w:lvl>
+    <w:lvl w:ilvl="2" w:tentative="1">
+      <w:start w:val="1"/>
+      <w:numFmt w:val="bullet"/>
+      <w:lvlText w:val=""/>
+      <w:lvlJc w:val="left"/>
+      <w:pPr>
+        <w:tabs>
+          <w:tab w:val="num" w:pos="2160"/>
+        </w:tabs>
+        <w:ind w:left="2160" w:hanging="360"/>
+      </w:pPr>
+      <w:rPr>
+        <w:rFonts w:ascii="Wingdings" w:hAnsi="Wingdings" w:hint="default"/>
+        <w:sz w:val="20"/>
+      </w:rPr>
+    </w:lvl>
+    <w:lvl w:ilvl="3" w:tentative="1">
+      <w:start w:val="1"/>
+      <w:numFmt w:val="bullet"/>
+      <w:lvlText w:val=""/>
+      <w:lvlJc w:val="left"/>
+      <w:pPr>
+        <w:tabs>
+          <w:tab w:val="num" w:pos="2880"/>
+        </w:tabs>
+        <w:ind w:left="2880" w:hanging="360"/>
+      </w:pPr>
+      <w:rPr>
+        <w:rFonts w:ascii="Wingdings" w:hAnsi="Wingdings" w:hint="default"/>
+        <w:sz w:val="20"/>
+      </w:rPr>
+    </w:lvl>
+    <w:lvl w:ilvl="4" w:tentative="1">
+      <w:start w:val="1"/>
+      <w:numFmt w:val="bullet"/>
+      <w:lvlText w:val=""/>
+      <w:lvlJc w:val="left"/>
+      <w:pPr>
+        <w:tabs>
+          <w:tab w:val="num" w:pos="3600"/>
+        </w:tabs>
+        <w:ind w:left="3600" w:hanging="360"/>
+      </w:pPr>
+      <w:rPr>
+        <w:rFonts w:ascii="Wingdings" w:hAnsi="Wingdings" w:hint="default"/>
+        <w:sz w:val="20"/>
+      </w:rPr>
+    </w:lvl>
+    <w:lvl w:ilvl="5" w:tentative="1">
+      <w:start w:val="1"/>
+      <w:numFmt w:val="bullet"/>
+      <w:lvlText w:val=""/>
+      <w:lvlJc w:val="left"/>
+      <w:pPr>
+        <w:tabs>
+          <w:tab w:val="num" w:pos="4320"/>
+        </w:tabs>
+        <w:ind w:left="4320" w:hanging="360"/>
+      </w:pPr>
+      <w:rPr>
+        <w:rFonts w:ascii="Wingdings" w:hAnsi="Wingdings" w:hint="default"/>
+        <w:sz w:val="20"/>
+      </w:rPr>
+    </w:lvl>
+    <w:lvl w:ilvl="6" w:tentative="1">
+      <w:start w:val="1"/>
+      <w:numFmt w:val="bullet"/>
+      <w:lvlText w:val=""/>
+      <w:lvlJc w:val="left"/>
+      <w:pPr>
+        <w:tabs>
+          <w:tab w:val="num" w:pos="5040"/>
+        </w:tabs>
+        <w:ind w:left="5040" w:hanging="360"/>
+      </w:pPr>
+      <w:rPr>
+        <w:rFonts w:ascii="Wingdings" w:hAnsi="Wingdings" w:hint="default"/>
+        <w:sz w:val="20"/>
+      </w:rPr>
+    </w:lvl>
+    <w:lvl w:ilvl="7" w:tentative="1">
+      <w:start w:val="1"/>
+      <w:numFmt w:val="bullet"/>
+      <w:lvlText w:val=""/>
+      <w:lvlJc w:val="left"/>
+      <w:pPr>
+        <w:tabs>
+          <w:tab w:val="num" w:pos="5760"/>
+        </w:tabs>
+        <w:ind w:left="5760" w:hanging="360"/>
+      </w:pPr>
+      <w:rPr>
+        <w:rFonts w:ascii="Wingdings" w:hAnsi="Wingdings" w:hint="default"/>
+        <w:sz w:val="20"/>
+      </w:rPr>
+    </w:lvl>
+    <w:lvl w:ilvl="8" w:tentative="1">
+      <w:start w:val="1"/>
+      <w:numFmt w:val="bullet"/>
+      <w:lvlText w:val=""/>
+      <w:lvlJc w:val="left"/>
+      <w:pPr>
+        <w:tabs>
+          <w:tab w:val="num" w:pos="6480"/>
+        </w:tabs>
+        <w:ind w:left="6480" w:hanging="360"/>
+      </w:pPr>
+      <w:rPr>
+        <w:rFonts w:ascii="Wingdings" w:hAnsi="Wingdings" w:hint="default"/>
+        <w:sz w:val="20"/>
+      </w:rPr>
+    </w:lvl>
+  </w:abstractNum>
+  <w:abstractNum w:abstractNumId="7" w15:restartNumberingAfterBreak="0">
     <w:nsid w:val="77496F9E"/>
     <w:multiLevelType w:val="hybridMultilevel"/>
     <w:tmpl w:val="D5EAE90E"/>
@@ -374,7 +1934,7 @@
       </w:pPr>
     </w:lvl>
   </w:abstractNum>
-  <w:abstractNum w:abstractNumId="1" w15:restartNumberingAfterBreak="0">
+  <w:abstractNum w:abstractNumId="8" w15:restartNumberingAfterBreak="0">
     <w:nsid w:val="7B2B70FD"/>
     <w:multiLevelType w:val="hybridMultilevel"/>
     <w:tmpl w:val="4476D3E2"/>
@@ -464,10 +2024,31 @@
     </w:lvl>
   </w:abstractNum>
   <w:num w:numId="1" w16cid:durableId="2142648709">
+    <w:abstractNumId w:val="8"/>
+  </w:num>
+  <w:num w:numId="2" w16cid:durableId="1943297980">
+    <w:abstractNumId w:val="7"/>
+  </w:num>
+  <w:num w:numId="3" w16cid:durableId="205063832">
+    <w:abstractNumId w:val="0"/>
+  </w:num>
+  <w:num w:numId="4" w16cid:durableId="1574579121">
+    <w:abstractNumId w:val="2"/>
+  </w:num>
+  <w:num w:numId="5" w16cid:durableId="829562725">
+    <w:abstractNumId w:val="5"/>
+  </w:num>
+  <w:num w:numId="6" w16cid:durableId="952828691">
+    <w:abstractNumId w:val="3"/>
+  </w:num>
+  <w:num w:numId="7" w16cid:durableId="516770345">
     <w:abstractNumId w:val="1"/>
   </w:num>
-  <w:num w:numId="2" w16cid:durableId="1943297980">
-    <w:abstractNumId w:val="0"/>
+  <w:num w:numId="8" w16cid:durableId="1616214743">
+    <w:abstractNumId w:val="4"/>
+  </w:num>
+  <w:num w:numId="9" w16cid:durableId="802699824">
+    <w:abstractNumId w:val="6"/>
   </w:num>
 </w:numbering>
 </file>

</xml_diff>